<commit_message>
Move sc_analyticfit and sc_analyticfit2 into scGEAToolbox
They belong beside sc_splinefit and sc_splinefit2, which is where the code
they replace already lives. sc_analyticfit2 could not stay here in any case:
a toolbox function cannot depend on a file in this repository.

Nothing here loses anything. Spline-DV already requires scGEAToolbox on the
path, so test.m, make_analytic_figures and depth_matching_experiment resolve
the two functions from the toolbox unchanged; all three were re-run against a
restored default path to confirm it.

The documentation is updated to say where the functions live, and gains the
sc_analyticfit2 call for a two-condition comparison in one step.

Co-Authored-By: Claude Opus 5 <noreply@anthropic.com>
</commit_message>
<xml_diff>
--- a/docs/Spline-DV_analytic_curve.docx
+++ b/docs/Spline-DV_analytic_curve.docx
@@ -5845,7 +5845,7 @@
           <w:sz w:val="20"/>
           <w:szCs w:val="20"/>
         </w:rPr>
-        <w:t xml:space="preserve">MATLAB/sc_analyticfit.m</w:t>
+        <w:t xml:space="preserve">sc_analyticfit</w:t>
       </w:r>
       <w:r>
         <w:t xml:space="preserve"> is a drop-in replacement for </w:t>
@@ -5870,7 +5870,40 @@
         <w:t xml:space="preserve">xyzFit(T.nearidx,:)</w:t>
       </w:r>
       <w:r>
-        <w:t xml:space="preserve"> call pattern:</w:t>
+        <w:t xml:space="preserve"> call pattern. It and the two-condition wrapper </w:t>
+      </w:r>
+      <w:r>
+        <w:rPr>
+          <w:rFonts w:ascii="Consolas" w:cs="Consolas" w:eastAsia="Consolas" w:hAnsi="Consolas"/>
+          <w:sz w:val="20"/>
+          <w:szCs w:val="20"/>
+        </w:rPr>
+        <w:t xml:space="preserve">sc_analyticfit2</w:t>
+      </w:r>
+      <w:r>
+        <w:t xml:space="preserve"> live in scGEAToolbox, beside </w:t>
+      </w:r>
+      <w:r>
+        <w:rPr>
+          <w:rFonts w:ascii="Consolas" w:cs="Consolas" w:eastAsia="Consolas" w:hAnsi="Consolas"/>
+          <w:sz w:val="20"/>
+          <w:szCs w:val="20"/>
+        </w:rPr>
+        <w:t xml:space="preserve">sc_splinefit</w:t>
+      </w:r>
+      <w:r>
+        <w:t xml:space="preserve"> and </w:t>
+      </w:r>
+      <w:r>
+        <w:rPr>
+          <w:rFonts w:ascii="Consolas" w:cs="Consolas" w:eastAsia="Consolas" w:hAnsi="Consolas"/>
+          <w:sz w:val="20"/>
+          <w:szCs w:val="20"/>
+        </w:rPr>
+        <w:t xml:space="preserve">sc_splinefit2</w:t>
+      </w:r>
+      <w:r>
+        <w:t xml:space="preserve">:</w:t>
       </w:r>
     </w:p>
     <w:p>
@@ -5906,6 +5939,39 @@
         <w:spacing w:after="140" w:line="288"/>
       </w:pPr>
       <w:r>
+        <w:t xml:space="preserve">For a two-condition comparison in one call, matching </w:t>
+      </w:r>
+      <w:r>
+        <w:rPr>
+          <w:rFonts w:ascii="Consolas" w:cs="Consolas" w:eastAsia="Consolas" w:hAnsi="Consolas"/>
+          <w:sz w:val="20"/>
+          <w:szCs w:val="20"/>
+        </w:rPr>
+        <w:t xml:space="preserve">sc_splinefit2</w:t>
+      </w:r>
+      <w:r>
+        <w:t xml:space="preserve">:</w:t>
+      </w:r>
+    </w:p>
+    <w:p>
+      <w:pPr>
+        <w:shd w:fill="F2F2F2" w:color="auto" w:val="clear"/>
+        <w:spacing w:after="80"/>
+      </w:pPr>
+      <w:r>
+        <w:rPr>
+          <w:rFonts w:ascii="Consolas" w:cs="Consolas" w:eastAsia="Consolas" w:hAnsi="Consolas"/>
+          <w:sz w:val="20"/>
+          <w:szCs w:val="20"/>
+        </w:rPr>
+        <w:t xml:space="preserve">[T, sx, sy, sz, d, params] = sc_analyticfit2(Xraw, Yraw, genelist);</w:t>
+      </w:r>
+    </w:p>
+    <w:p>
+      <w:pPr>
+        <w:spacing w:after="140" w:line="288"/>
+      </w:pPr>
+      <w:r>
         <w:t xml:space="preserve">Pass </w:t>
       </w:r>
       <w:r>
@@ -5950,7 +6016,7 @@
         <w:t xml:space="preserve">Dispersion=0</w:t>
       </w:r>
       <w:r>
-        <w:t xml:space="preserve"> gives the pure-Poisson technical null; the default fits </w:t>
+        <w:t xml:space="preserve"> gives the pure-Poisson technical null, a scalar forces one </w:t>
       </w:r>
       <m:oMath>
         <m:r>
@@ -5958,7 +6024,15 @@
         </m:r>
       </m:oMath>
       <w:r>
-        <w:t xml:space="preserve"> robustly by equation (16).</w:t>
+        <w:t xml:space="preserve"> on both conditions, and the default fits </w:t>
+      </w:r>
+      <m:oMath>
+        <m:r>
+          <m:t>φ</m:t>
+        </m:r>
+      </m:oMath>
+      <w:r>
+        <w:t xml:space="preserve"> robustly per condition by equation (16).</w:t>
       </w:r>
     </w:p>
     <w:sectPr>

</xml_diff>

<commit_message>
Document why the N-1 divisor makes alpha exact
The CV derivation uses the population variance while the pipeline calls
std(X,0,.), which divides by N-1, and the write-up did not say why that is
harmless. It is better than harmless: for independent X_j with a common mean
but per-cell variances sigma_j^2,

  E[sum_j (X_j - m)^2] = (1 - 1/n) sum_j sigma_j^2

so dividing by n-1 gives exactly mean(sigma_j^2), with no remainder of order
1/n. That is precisely the quantity alpha is built from, so alpha needs no
finite-sample correction.

Confirmed by simulation on a synthetic Poisson gene at mu = 1 CP10K over 2000
replicates: mean sample variance 1.99850 against c^2 lambda mean(1/L_j) =
1.99729, a 0.06% gap that is Monte Carlo noise.

Added to both the Markdown and, as section 4.1, the Word document. The
identity names the sample mean m rather than using an overbar, which Word's
math font would not composite onto the X.

Co-Authored-By: Claude Opus 5 <noreply@anthropic.com>
</commit_message>
<xml_diff>
--- a/docs/Spline-DV_analytic_curve.docx
+++ b/docs/Spline-DV_analytic_curve.docx
@@ -1197,6 +1197,466 @@
       </m:oMath>
       <w:r>
         <w:t xml:space="preserve"> = 1.997 and 1.597.</w:t>
+      </w:r>
+    </w:p>
+    <w:p>
+      <w:pPr>
+        <w:pStyle w:val="Heading2"/>
+        <w:spacing w:after="120" w:before="240"/>
+      </w:pPr>
+      <w:r>
+        <w:t xml:space="preserve">4.1 On the divisor</w:t>
+      </w:r>
+    </w:p>
+    <w:p>
+      <w:pPr>
+        <w:spacing w:after="140" w:line="288"/>
+      </w:pPr>
+      <w:r>
+        <w:t xml:space="preserve">The step above uses the population variance, while the pipeline calls </w:t>
+      </w:r>
+      <w:r>
+        <w:rPr>
+          <w:rFonts w:ascii="Consolas" w:cs="Consolas" w:eastAsia="Consolas" w:hAnsi="Consolas"/>
+          <w:sz w:val="20"/>
+          <w:szCs w:val="20"/>
+        </w:rPr>
+        <w:t xml:space="preserve">std(X,0,·)</w:t>
+      </w:r>
+      <w:r>
+        <w:t xml:space="preserve">, which divides by </w:t>
+      </w:r>
+      <m:oMath>
+        <m:r>
+          <m:t>N − 1</m:t>
+        </m:r>
+      </m:oMath>
+      <w:r>
+        <w:t xml:space="preserve">. That is exactly what makes </w:t>
+      </w:r>
+      <m:oMath>
+        <m:r>
+          <m:t>α</m:t>
+        </m:r>
+      </m:oMath>
+      <w:r>
+        <w:t xml:space="preserve"> correct rather than approximately correct. For independent </w:t>
+      </w:r>
+      <m:oMath>
+        <m:sSub>
+          <m:sSubPr/>
+          <m:e>
+            <m:r>
+              <m:t>X</m:t>
+            </m:r>
+          </m:e>
+          <m:sub>
+            <m:r>
+              <m:t>j</m:t>
+            </m:r>
+          </m:sub>
+        </m:sSub>
+      </m:oMath>
+      <w:r>
+        <w:t xml:space="preserve"> with a common mean but per-cell variances </w:t>
+      </w:r>
+      <m:oMath>
+        <m:sSup>
+          <m:sSupPr/>
+          <m:e>
+            <m:sSub>
+              <m:sSubPr/>
+              <m:e>
+                <m:r>
+                  <m:t>σ</m:t>
+                </m:r>
+              </m:e>
+              <m:sub>
+                <m:r>
+                  <m:t>j</m:t>
+                </m:r>
+              </m:sub>
+            </m:sSub>
+          </m:e>
+          <m:sup>
+            <m:r>
+              <m:t>2</m:t>
+            </m:r>
+          </m:sup>
+        </m:sSup>
+      </m:oMath>
+      <w:r>
+        <w:t xml:space="preserve">, and </w:t>
+      </w:r>
+      <m:oMath>
+        <m:r>
+          <m:t>m</m:t>
+        </m:r>
+      </m:oMath>
+      <w:r>
+        <w:t xml:space="preserve"> the sample mean,</w:t>
+      </w:r>
+    </w:p>
+    <w:p>
+      <w:pPr>
+        <w:spacing w:after="180" w:before="60"/>
+        <w:jc w:val="center"/>
+      </w:pPr>
+      <m:oMath>
+        <m:r>
+          <m:rPr>
+            <m:nor/>
+          </m:rPr>
+          <m:t xml:space="preserve">E</m:t>
+        </m:r>
+        <m:d>
+          <m:dPr>
+            <m:begChr m:val="["/>
+            <m:endChr m:val="]"/>
+          </m:dPr>
+          <m:e>
+            <m:nary>
+              <m:naryPr>
+                <m:chr m:val="∑"/>
+                <m:limLoc m:val="undOvr"/>
+              </m:naryPr>
+              <m:sub>
+                <m:r>
+                  <m:t>j=1</m:t>
+                </m:r>
+              </m:sub>
+              <m:sup>
+                <m:r>
+                  <m:t>n</m:t>
+                </m:r>
+              </m:sup>
+              <m:e>
+                <m:sSup>
+                  <m:sSupPr/>
+                  <m:e>
+                    <m:d>
+                      <m:dPr/>
+                      <m:e>
+                        <m:sSub>
+                          <m:sSubPr/>
+                          <m:e>
+                            <m:r>
+                              <m:t>X</m:t>
+                            </m:r>
+                          </m:e>
+                          <m:sub>
+                            <m:r>
+                              <m:t>j</m:t>
+                            </m:r>
+                          </m:sub>
+                        </m:sSub>
+                        <m:r>
+                          <m:t> − </m:t>
+                        </m:r>
+                        <m:r>
+                          <m:t>m</m:t>
+                        </m:r>
+                      </m:e>
+                    </m:d>
+                  </m:e>
+                  <m:sup>
+                    <m:r>
+                      <m:t>2</m:t>
+                    </m:r>
+                  </m:sup>
+                </m:sSup>
+              </m:e>
+            </m:nary>
+          </m:e>
+        </m:d>
+        <m:r>
+          <m:t> = </m:t>
+        </m:r>
+        <m:d>
+          <m:dPr/>
+          <m:e>
+            <m:r>
+              <m:t>1 − </m:t>
+            </m:r>
+            <m:f>
+              <m:num>
+                <m:r>
+                  <m:t>1</m:t>
+                </m:r>
+              </m:num>
+              <m:den>
+                <m:r>
+                  <m:t>n</m:t>
+                </m:r>
+              </m:den>
+            </m:f>
+          </m:e>
+        </m:d>
+        <m:nary>
+          <m:naryPr>
+            <m:chr m:val="∑"/>
+            <m:limLoc m:val="undOvr"/>
+          </m:naryPr>
+          <m:sub>
+            <m:r>
+              <m:t>j=1</m:t>
+            </m:r>
+          </m:sub>
+          <m:sup>
+            <m:r>
+              <m:t>n</m:t>
+            </m:r>
+          </m:sup>
+          <m:e>
+            <m:sSup>
+              <m:sSupPr/>
+              <m:e>
+                <m:sSub>
+                  <m:sSubPr/>
+                  <m:e>
+                    <m:r>
+                      <m:t>σ</m:t>
+                    </m:r>
+                  </m:e>
+                  <m:sub>
+                    <m:r>
+                      <m:t>j</m:t>
+                    </m:r>
+                  </m:sub>
+                </m:sSub>
+              </m:e>
+              <m:sup>
+                <m:r>
+                  <m:t>2</m:t>
+                </m:r>
+              </m:sup>
+            </m:sSup>
+          </m:e>
+        </m:nary>
+      </m:oMath>
+    </w:p>
+    <w:p>
+      <w:pPr>
+        <w:spacing w:after="140" w:line="288"/>
+      </w:pPr>
+      <w:r>
+        <w:t xml:space="preserve">and therefore</w:t>
+      </w:r>
+    </w:p>
+    <w:p>
+      <w:pPr>
+        <w:spacing w:after="180" w:before="60"/>
+        <w:jc w:val="center"/>
+      </w:pPr>
+      <m:oMath>
+        <m:r>
+          <m:rPr>
+            <m:nor/>
+          </m:rPr>
+          <m:t xml:space="preserve">E</m:t>
+        </m:r>
+        <m:d>
+          <m:dPr>
+            <m:begChr m:val="["/>
+            <m:endChr m:val="]"/>
+          </m:dPr>
+          <m:e>
+            <m:f>
+              <m:num>
+                <m:r>
+                  <m:t>1</m:t>
+                </m:r>
+              </m:num>
+              <m:den>
+                <m:r>
+                  <m:t>n − 1</m:t>
+                </m:r>
+              </m:den>
+            </m:f>
+            <m:nary>
+              <m:naryPr>
+                <m:chr m:val="∑"/>
+                <m:limLoc m:val="undOvr"/>
+              </m:naryPr>
+              <m:sub>
+                <m:r>
+                  <m:t>j=1</m:t>
+                </m:r>
+              </m:sub>
+              <m:sup>
+                <m:r>
+                  <m:t>n</m:t>
+                </m:r>
+              </m:sup>
+              <m:e>
+                <m:sSup>
+                  <m:sSupPr/>
+                  <m:e>
+                    <m:d>
+                      <m:dPr/>
+                      <m:e>
+                        <m:sSub>
+                          <m:sSubPr/>
+                          <m:e>
+                            <m:r>
+                              <m:t>X</m:t>
+                            </m:r>
+                          </m:e>
+                          <m:sub>
+                            <m:r>
+                              <m:t>j</m:t>
+                            </m:r>
+                          </m:sub>
+                        </m:sSub>
+                        <m:r>
+                          <m:t> − </m:t>
+                        </m:r>
+                        <m:r>
+                          <m:t>m</m:t>
+                        </m:r>
+                      </m:e>
+                    </m:d>
+                  </m:e>
+                  <m:sup>
+                    <m:r>
+                      <m:t>2</m:t>
+                    </m:r>
+                  </m:sup>
+                </m:sSup>
+              </m:e>
+            </m:nary>
+          </m:e>
+        </m:d>
+        <m:r>
+          <m:t> = </m:t>
+        </m:r>
+        <m:f>
+          <m:num>
+            <m:r>
+              <m:t>1</m:t>
+            </m:r>
+          </m:num>
+          <m:den>
+            <m:r>
+              <m:t>n</m:t>
+            </m:r>
+          </m:den>
+        </m:f>
+        <m:nary>
+          <m:naryPr>
+            <m:chr m:val="∑"/>
+            <m:limLoc m:val="undOvr"/>
+          </m:naryPr>
+          <m:sub>
+            <m:r>
+              <m:t>j=1</m:t>
+            </m:r>
+          </m:sub>
+          <m:sup>
+            <m:r>
+              <m:t>n</m:t>
+            </m:r>
+          </m:sup>
+          <m:e>
+            <m:sSup>
+              <m:sSupPr/>
+              <m:e>
+                <m:sSub>
+                  <m:sSubPr/>
+                  <m:e>
+                    <m:r>
+                      <m:t>σ</m:t>
+                    </m:r>
+                  </m:e>
+                  <m:sub>
+                    <m:r>
+                      <m:t>j</m:t>
+                    </m:r>
+                  </m:sub>
+                </m:sSub>
+              </m:e>
+              <m:sup>
+                <m:r>
+                  <m:t>2</m:t>
+                </m:r>
+              </m:sup>
+            </m:sSup>
+          </m:e>
+        </m:nary>
+      </m:oMath>
+    </w:p>
+    <w:p>
+      <w:pPr>
+        <w:spacing w:after="140" w:line="288"/>
+      </w:pPr>
+      <w:r>
+        <w:t xml:space="preserve">with no remainder of order </w:t>
+      </w:r>
+      <m:oMath>
+        <m:r>
+          <m:t>1/n</m:t>
+        </m:r>
+      </m:oMath>
+      <w:r>
+        <w:t xml:space="preserve">. Simulated on a synthetic Poisson gene at </w:t>
+      </w:r>
+      <m:oMath>
+        <m:r>
+          <m:t>μ = 1</m:t>
+        </m:r>
+      </m:oMath>
+      <w:r>
+        <w:t xml:space="preserve"> CP10K over 2000 replicates, the mean sample variance is 1.99850 against </w:t>
+      </w:r>
+      <m:oMath>
+        <m:sSup>
+          <m:sSupPr/>
+          <m:e>
+            <m:r>
+              <m:t>c</m:t>
+            </m:r>
+          </m:e>
+          <m:sup>
+            <m:r>
+              <m:t>2</m:t>
+            </m:r>
+          </m:sup>
+        </m:sSup>
+        <m:r>
+          <m:t>λ</m:t>
+        </m:r>
+      </m:oMath>
+      <w:r>
+        <w:t xml:space="preserve"> times the mean of </w:t>
+      </w:r>
+      <m:oMath>
+        <m:r>
+          <m:t>1/</m:t>
+        </m:r>
+        <m:sSub>
+          <m:sSubPr/>
+          <m:e>
+            <m:r>
+              <m:t>L</m:t>
+            </m:r>
+          </m:e>
+          <m:sub>
+            <m:r>
+              <m:t>j</m:t>
+            </m:r>
+          </m:sub>
+        </m:sSub>
+      </m:oMath>
+      <w:r>
+        <w:t xml:space="preserve"> = 1.99729, a 0.06% gap that is Monte Carlo noise. So </w:t>
+      </w:r>
+      <m:oMath>
+        <m:r>
+          <m:t>α</m:t>
+        </m:r>
+      </m:oMath>
+      <w:r>
+        <w:t xml:space="preserve"> needs no finite-sample correction.</w:t>
       </w:r>
     </w:p>
     <w:p>

</xml_diff>